<commit_message>
Finished search bar UI and backend
Need to build the Freelancer menu that coressponds with the search and build the backend and UI
</commit_message>
<xml_diff>
--- a/מסמך אפיון פרויקט סייבר.docx
+++ b/מסמך אפיון פרויקט סייבר.docx
@@ -552,7 +552,6 @@
           <w:lang w:bidi="he-IL"/>
         </w:rPr>
       </w:pPr>
-      <w:proofErr w:type="spellStart"/>
       <w:r>
         <w:rPr>
           <w:rFonts w:asciiTheme="majorBidi" w:hAnsiTheme="majorBidi" w:cstheme="majorBidi" w:hint="cs"/>
@@ -561,37 +560,26 @@
           <w:rtl/>
           <w:lang w:bidi="he-IL"/>
         </w:rPr>
-        <w:t>צאטים</w:t>
-      </w:r>
-      <w:proofErr w:type="spellEnd"/>
-      <w:r>
-        <w:rPr>
-          <w:rFonts w:asciiTheme="majorBidi" w:hAnsiTheme="majorBidi" w:cstheme="majorBidi" w:hint="cs"/>
+        <w:t xml:space="preserve">צאטים </w:t>
+      </w:r>
+      <w:r>
+        <w:rPr>
+          <w:rFonts w:asciiTheme="majorBidi" w:hAnsiTheme="majorBidi" w:cstheme="majorBidi"/>
           <w:b/>
           <w:bCs/>
           <w:rtl/>
           <w:lang w:bidi="he-IL"/>
         </w:rPr>
-        <w:t xml:space="preserve"> </w:t>
-      </w:r>
-      <w:r>
-        <w:rPr>
-          <w:rFonts w:asciiTheme="majorBidi" w:hAnsiTheme="majorBidi" w:cstheme="majorBidi"/>
+        <w:t>–</w:t>
+      </w:r>
+      <w:r>
+        <w:rPr>
+          <w:rFonts w:asciiTheme="majorBidi" w:hAnsiTheme="majorBidi" w:cstheme="majorBidi" w:hint="cs"/>
           <w:b/>
           <w:bCs/>
           <w:rtl/>
           <w:lang w:bidi="he-IL"/>
         </w:rPr>
-        <w:t>–</w:t>
-      </w:r>
-      <w:r>
-        <w:rPr>
-          <w:rFonts w:asciiTheme="majorBidi" w:hAnsiTheme="majorBidi" w:cstheme="majorBidi" w:hint="cs"/>
-          <w:b/>
-          <w:bCs/>
-          <w:rtl/>
-          <w:lang w:bidi="he-IL"/>
-        </w:rPr>
         <w:t xml:space="preserve"> </w:t>
       </w:r>
       <w:r>
@@ -600,25 +588,7 @@
           <w:rtl/>
           <w:lang w:bidi="he-IL"/>
         </w:rPr>
-        <w:t xml:space="preserve">כאשר אתה מסתכל על בעל מקצוע תוכל לפנות אליו עם </w:t>
-      </w:r>
-      <w:proofErr w:type="spellStart"/>
-      <w:r>
-        <w:rPr>
-          <w:rFonts w:asciiTheme="majorBidi" w:hAnsiTheme="majorBidi" w:cstheme="majorBidi" w:hint="cs"/>
-          <w:rtl/>
-          <w:lang w:bidi="he-IL"/>
-        </w:rPr>
-        <w:t>צאט</w:t>
-      </w:r>
-      <w:proofErr w:type="spellEnd"/>
-      <w:r>
-        <w:rPr>
-          <w:rFonts w:asciiTheme="majorBidi" w:hAnsiTheme="majorBidi" w:cstheme="majorBidi" w:hint="cs"/>
-          <w:rtl/>
-          <w:lang w:bidi="he-IL"/>
-        </w:rPr>
-        <w:t xml:space="preserve"> מובנה באתר.</w:t>
+        <w:t>כאשר אתה מסתכל על בעל מקצוע תוכל לפנות אליו עם צאט מובנה באתר.</w:t>
       </w:r>
     </w:p>
     <w:p>
@@ -730,25 +700,7 @@
           <w:rtl/>
           <w:lang w:bidi="he-IL"/>
         </w:rPr>
-        <w:t xml:space="preserve">ויכול להיות שאתקל בקשיים שאני לא מודע אליהם. הקשיים העיקריים שאני צופה לקראת הפרויקט זה השימוש </w:t>
-      </w:r>
-      <w:proofErr w:type="spellStart"/>
-      <w:r>
-        <w:rPr>
-          <w:rFonts w:asciiTheme="majorBidi" w:hAnsiTheme="majorBidi" w:cstheme="majorBidi" w:hint="cs"/>
-          <w:rtl/>
-          <w:lang w:bidi="he-IL"/>
-        </w:rPr>
-        <w:t>בריאקט</w:t>
-      </w:r>
-      <w:proofErr w:type="spellEnd"/>
-      <w:r>
-        <w:rPr>
-          <w:rFonts w:asciiTheme="majorBidi" w:hAnsiTheme="majorBidi" w:cstheme="majorBidi" w:hint="cs"/>
-          <w:rtl/>
-          <w:lang w:bidi="he-IL"/>
-        </w:rPr>
-        <w:t xml:space="preserve"> ניהול מאגר נתונים בצורה יעילה וטובה</w:t>
+        <w:t>ויכול להיות שאתקל בקשיים שאני לא מודע אליהם. הקשיים העיקריים שאני צופה לקראת הפרויקט זה השימוש בריאקט ניהול מאגר נתונים בצורה יעילה וטובה</w:t>
       </w:r>
       <w:r>
         <w:rPr>
@@ -842,49 +794,15 @@
         </w:rPr>
         <w:t xml:space="preserve">-WhatsApp, </w:t>
       </w:r>
-      <w:proofErr w:type="spellStart"/>
-      <w:r>
-        <w:rPr>
-          <w:rFonts w:asciiTheme="majorBidi" w:hAnsiTheme="majorBidi"/>
-          <w:sz w:val="24"/>
-          <w:szCs w:val="24"/>
-          <w:rtl/>
-          <w:lang w:bidi="he-IL"/>
-        </w:rPr>
-        <w:t>פייסבוק</w:t>
-      </w:r>
-      <w:proofErr w:type="spellEnd"/>
-      <w:r>
-        <w:rPr>
-          <w:rFonts w:asciiTheme="majorBidi" w:hAnsiTheme="majorBidi"/>
-          <w:sz w:val="24"/>
-          <w:szCs w:val="24"/>
-          <w:rtl/>
-          <w:lang w:bidi="he-IL"/>
-        </w:rPr>
-        <w:t xml:space="preserve"> או </w:t>
-      </w:r>
-      <w:proofErr w:type="spellStart"/>
-      <w:r>
-        <w:rPr>
-          <w:rFonts w:asciiTheme="majorBidi" w:hAnsiTheme="majorBidi"/>
-          <w:sz w:val="24"/>
-          <w:szCs w:val="24"/>
-          <w:rtl/>
-          <w:lang w:bidi="he-IL"/>
-        </w:rPr>
-        <w:t>אינסטגרם</w:t>
-      </w:r>
-      <w:proofErr w:type="spellEnd"/>
-      <w:r>
-        <w:rPr>
-          <w:rFonts w:asciiTheme="majorBidi" w:hAnsiTheme="majorBidi"/>
-          <w:sz w:val="24"/>
-          <w:szCs w:val="24"/>
-          <w:rtl/>
-          <w:lang w:bidi="he-IL"/>
-        </w:rPr>
-        <w:t>. השיטה הזו יוצרת כמה בעיות עיקריות</w:t>
+      <w:r>
+        <w:rPr>
+          <w:rFonts w:asciiTheme="majorBidi" w:hAnsiTheme="majorBidi"/>
+          <w:sz w:val="24"/>
+          <w:szCs w:val="24"/>
+          <w:rtl/>
+          <w:lang w:bidi="he-IL"/>
+        </w:rPr>
+        <w:t>פייסבוק או אינסטגרם. השיטה הזו יוצרת כמה בעיות עיקריות</w:t>
       </w:r>
       <w:r>
         <w:rPr>
@@ -1028,29 +946,7 @@
           <w:rtl/>
           <w:lang w:bidi="he-IL"/>
         </w:rPr>
-        <w:t xml:space="preserve">לקוח שרוצה שירות צריך לחפש בעצמו בקבוצות, </w:t>
-      </w:r>
-      <w:proofErr w:type="spellStart"/>
-      <w:r>
-        <w:rPr>
-          <w:rFonts w:asciiTheme="majorBidi" w:hAnsiTheme="majorBidi"/>
-          <w:sz w:val="24"/>
-          <w:szCs w:val="24"/>
-          <w:rtl/>
-          <w:lang w:bidi="he-IL"/>
-        </w:rPr>
-        <w:t>בפייסבוק</w:t>
-      </w:r>
-      <w:proofErr w:type="spellEnd"/>
-      <w:r>
-        <w:rPr>
-          <w:rFonts w:asciiTheme="majorBidi" w:hAnsiTheme="majorBidi"/>
-          <w:sz w:val="24"/>
-          <w:szCs w:val="24"/>
-          <w:rtl/>
-          <w:lang w:bidi="he-IL"/>
-        </w:rPr>
-        <w:t>, בהמלצות מחברים – בלי פילטרים ברורים, בלי דירוגים ובלי דרך לראות זמינות אמיתית</w:t>
+        <w:t>לקוח שרוצה שירות צריך לחפש בעצמו בקבוצות, בפייסבוק, בהמלצות מחברים – בלי פילטרים ברורים, בלי דירוגים ובלי דרך לראות זמינות אמיתית</w:t>
       </w:r>
       <w:r>
         <w:rPr>
@@ -1526,29 +1422,7 @@
           <w:rtl/>
           <w:lang w:bidi="he-IL"/>
         </w:rPr>
-        <w:t xml:space="preserve">התקשורת בין הצדדים מרוכזת בתיבה אחת. כך אין אובדן הודעות, אין ערבוב בין </w:t>
-      </w:r>
-      <w:proofErr w:type="spellStart"/>
-      <w:r>
-        <w:rPr>
-          <w:rFonts w:asciiTheme="majorBidi" w:hAnsiTheme="majorBidi"/>
-          <w:sz w:val="24"/>
-          <w:szCs w:val="24"/>
-          <w:rtl/>
-          <w:lang w:bidi="he-IL"/>
-        </w:rPr>
-        <w:t>וואטסאפ</w:t>
-      </w:r>
-      <w:proofErr w:type="spellEnd"/>
-      <w:r>
-        <w:rPr>
-          <w:rFonts w:asciiTheme="majorBidi" w:hAnsiTheme="majorBidi"/>
-          <w:sz w:val="24"/>
-          <w:szCs w:val="24"/>
-          <w:rtl/>
-          <w:lang w:bidi="he-IL"/>
-        </w:rPr>
-        <w:t xml:space="preserve"> אישי לעבודה, והכול נשמר בצורה מקצועית</w:t>
+        <w:t>התקשורת בין הצדדים מרוכזת בתיבה אחת. כך אין אובדן הודעות, אין ערבוב בין וואטסאפ אישי לעבודה, והכול נשמר בצורה מקצועית</w:t>
       </w:r>
       <w:r>
         <w:rPr>
@@ -2625,25 +2499,7 @@
           <w:rtl/>
           <w:lang w:bidi="he-IL"/>
         </w:rPr>
-        <w:t xml:space="preserve">כמות </w:t>
-      </w:r>
-      <w:proofErr w:type="spellStart"/>
-      <w:r>
-        <w:rPr>
-          <w:rFonts w:asciiTheme="majorBidi" w:hAnsiTheme="majorBidi" w:cstheme="majorBidi"/>
-          <w:rtl/>
-          <w:lang w:bidi="he-IL"/>
-        </w:rPr>
-        <w:t>תומונות</w:t>
-      </w:r>
-      <w:proofErr w:type="spellEnd"/>
-      <w:r>
-        <w:rPr>
-          <w:rFonts w:asciiTheme="majorBidi" w:hAnsiTheme="majorBidi" w:cstheme="majorBidi"/>
-          <w:rtl/>
-          <w:lang w:bidi="he-IL"/>
-        </w:rPr>
-        <w:t xml:space="preserve"> מוגבל</w:t>
+        <w:t>כמות תומונות מוגבל</w:t>
       </w:r>
       <w:r>
         <w:rPr>
@@ -2731,25 +2587,7 @@
           <w:rtl/>
           <w:lang w:bidi="he-IL"/>
         </w:rPr>
-        <w:t xml:space="preserve">באתר מנגנון שסורק הודעות כדי לבדוק שאין החלפה של פרטים </w:t>
-      </w:r>
-      <w:proofErr w:type="spellStart"/>
-      <w:r>
-        <w:rPr>
-          <w:rFonts w:asciiTheme="majorBidi" w:hAnsiTheme="majorBidi" w:cstheme="majorBidi" w:hint="cs"/>
-          <w:rtl/>
-          <w:lang w:bidi="he-IL"/>
-        </w:rPr>
-        <w:t>איישים</w:t>
-      </w:r>
-      <w:proofErr w:type="spellEnd"/>
-      <w:r>
-        <w:rPr>
-          <w:rFonts w:asciiTheme="majorBidi" w:hAnsiTheme="majorBidi" w:cstheme="majorBidi" w:hint="cs"/>
-          <w:rtl/>
-          <w:lang w:bidi="he-IL"/>
-        </w:rPr>
-        <w:t>. מערכת זו דבר ראשון מעוד פולשנית מכיוון שבאה להגון על הפרטיות של הפרט אבל בסוף חודרת מאוד כי קוראת כל הודעה ובודקת.</w:t>
+        <w:t>באתר מנגנון שסורק הודעות כדי לבדוק שאין החלפה של פרטים איישים. מערכת זו דבר ראשון מעוד פולשנית מכיוון שבאה להגון על הפרטיות של הפרט אבל בסוף חודרת מאוד כי קוראת כל הודעה ובודקת.</w:t>
       </w:r>
     </w:p>
     <w:p>
@@ -3142,25 +2980,7 @@
           <w:rtl/>
           <w:lang w:bidi="he-IL"/>
         </w:rPr>
-        <w:t xml:space="preserve">יש אלגוריתם חכם שמנסה להתאים בין הצרכים של הלקוחות אל </w:t>
-      </w:r>
-      <w:proofErr w:type="spellStart"/>
-      <w:r>
-        <w:rPr>
-          <w:rFonts w:asciiTheme="majorBidi" w:hAnsiTheme="majorBidi" w:cstheme="majorBidi" w:hint="cs"/>
-          <w:rtl/>
-          <w:lang w:bidi="he-IL"/>
-        </w:rPr>
-        <w:t>האנשי</w:t>
-      </w:r>
-      <w:proofErr w:type="spellEnd"/>
-      <w:r>
-        <w:rPr>
-          <w:rFonts w:asciiTheme="majorBidi" w:hAnsiTheme="majorBidi" w:cstheme="majorBidi" w:hint="cs"/>
-          <w:rtl/>
-          <w:lang w:bidi="he-IL"/>
-        </w:rPr>
-        <w:t xml:space="preserve"> המקצוע המתאימים על בסיס הפרויקט שהמשתמש הגיש</w:t>
+        <w:t>יש אלגוריתם חכם שמנסה להתאים בין הצרכים של הלקוחות אל האנשי המקצוע המתאימים על בסיס הפרויקט שהמשתמש הגיש</w:t>
       </w:r>
     </w:p>
     <w:p>
@@ -3312,25 +3132,7 @@
           <w:rtl/>
           <w:lang w:bidi="he-IL"/>
         </w:rPr>
-        <w:t xml:space="preserve">בעלי מקצוע משלמים על </w:t>
-      </w:r>
-      <w:proofErr w:type="spellStart"/>
-      <w:r>
-        <w:rPr>
-          <w:rFonts w:asciiTheme="majorBidi" w:hAnsiTheme="majorBidi" w:cstheme="majorBidi" w:hint="cs"/>
-          <w:rtl/>
-          <w:lang w:bidi="he-IL"/>
-        </w:rPr>
-        <w:t>לידים</w:t>
-      </w:r>
-      <w:proofErr w:type="spellEnd"/>
-      <w:r>
-        <w:rPr>
-          <w:rFonts w:asciiTheme="majorBidi" w:hAnsiTheme="majorBidi" w:cstheme="majorBidi" w:hint="cs"/>
-          <w:rtl/>
-          <w:lang w:bidi="he-IL"/>
-        </w:rPr>
-        <w:t xml:space="preserve"> בכל פעם שמישהו פונה אליהם </w:t>
+        <w:t xml:space="preserve">בעלי מקצוע משלמים על לידים בכל פעם שמישהו פונה אליהם </w:t>
       </w:r>
       <w:r>
         <w:rPr>
@@ -6254,43 +6056,7 @@
           <w:rtl/>
           <w:lang w:bidi="he-IL"/>
         </w:rPr>
-        <w:t xml:space="preserve">הראשונה, לשלוח מחדש מהשרת את המידע כל פעם. זה בעצם אומר שבכל הודעה </w:t>
-      </w:r>
-      <w:proofErr w:type="spellStart"/>
-      <w:r>
-        <w:rPr>
-          <w:rFonts w:asciiTheme="majorBidi" w:hAnsiTheme="majorBidi" w:cstheme="majorBidi" w:hint="cs"/>
-          <w:rtl/>
-          <w:lang w:bidi="he-IL"/>
-        </w:rPr>
-        <w:t>שאיך</w:t>
-      </w:r>
-      <w:proofErr w:type="spellEnd"/>
-      <w:r>
-        <w:rPr>
-          <w:rFonts w:asciiTheme="majorBidi" w:hAnsiTheme="majorBidi" w:cstheme="majorBidi" w:hint="cs"/>
-          <w:rtl/>
-          <w:lang w:bidi="he-IL"/>
-        </w:rPr>
-        <w:t xml:space="preserve"> שהוא </w:t>
-      </w:r>
-      <w:proofErr w:type="spellStart"/>
-      <w:r>
-        <w:rPr>
-          <w:rFonts w:asciiTheme="majorBidi" w:hAnsiTheme="majorBidi" w:cstheme="majorBidi" w:hint="cs"/>
-          <w:rtl/>
-          <w:lang w:bidi="he-IL"/>
-        </w:rPr>
-        <w:t>כרוככה</w:t>
-      </w:r>
-      <w:proofErr w:type="spellEnd"/>
-      <w:r>
-        <w:rPr>
-          <w:rFonts w:asciiTheme="majorBidi" w:hAnsiTheme="majorBidi" w:cstheme="majorBidi" w:hint="cs"/>
-          <w:rtl/>
-          <w:lang w:bidi="he-IL"/>
-        </w:rPr>
-        <w:t xml:space="preserve"> בפרטים של המשתמש אצטרך לשלוח מחדש את כל המידע מהמשתמש. דבר כזה הוא מאוד לא נפוץ בתכנות מכיוון ומבזבז המון זמן בשליחת מידע חוזר ולא מיעל אף תהליך בדרך.</w:t>
+        <w:t>הראשונה, לשלוח מחדש מהשרת את המידע כל פעם. זה בעצם אומר שבכל הודעה שאיך שהוא כרוככה בפרטים של המשתמש אצטרך לשלוח מחדש את כל המידע מהמשתמש. דבר כזה הוא מאוד לא נפוץ בתכנות מכיוון ומבזבז המון זמן בשליחת מידע חוזר ולא מיעל אף תהליך בדרך.</w:t>
       </w:r>
     </w:p>
     <w:p>
@@ -6342,51 +6108,15 @@
           <w:rtl/>
           <w:lang w:bidi="he-IL"/>
         </w:rPr>
-        <w:t xml:space="preserve"> זה בעצם הוק בשפת ריאקט. עם הפעולה הזאת ניתן לשמור מצבים של משתנים בצורה לוקלית. אבל מכיוון ומדובר באתר וכל הזמן מקפצים בין עמודים אז שמירת נתונים במקום לוקלי זה לא ממש אופציה. לכן אפשר להעביר אותם </w:t>
-      </w:r>
-      <w:proofErr w:type="spellStart"/>
-      <w:r>
-        <w:rPr>
-          <w:rFonts w:asciiTheme="majorBidi" w:hAnsiTheme="majorBidi" w:cstheme="majorBidi" w:hint="cs"/>
-          <w:rtl/>
-          <w:lang w:bidi="he-IL"/>
-        </w:rPr>
-        <w:t>כ</w:t>
-      </w:r>
-      <w:r>
-        <w:rPr>
-          <w:rFonts w:asciiTheme="majorBidi" w:hAnsiTheme="majorBidi" w:cstheme="majorBidi" w:hint="cs"/>
-          <w:rtl/>
-          <w:lang w:bidi="he-IL"/>
-        </w:rPr>
-        <w:t>פרופס</w:t>
-      </w:r>
-      <w:proofErr w:type="spellEnd"/>
-      <w:r>
-        <w:rPr>
-          <w:rFonts w:asciiTheme="majorBidi" w:hAnsiTheme="majorBidi" w:cstheme="majorBidi" w:hint="cs"/>
-          <w:rtl/>
-          <w:lang w:bidi="he-IL"/>
-        </w:rPr>
-        <w:t xml:space="preserve"> (פרמטרים בשפת ריאקט) אל </w:t>
-      </w:r>
-      <w:proofErr w:type="spellStart"/>
-      <w:r>
-        <w:rPr>
-          <w:rFonts w:asciiTheme="majorBidi" w:hAnsiTheme="majorBidi" w:cstheme="majorBidi" w:hint="cs"/>
-          <w:rtl/>
-          <w:lang w:bidi="he-IL"/>
-        </w:rPr>
-        <w:t>הקומפוננטס</w:t>
-      </w:r>
-      <w:proofErr w:type="spellEnd"/>
-      <w:r>
-        <w:rPr>
-          <w:rFonts w:asciiTheme="majorBidi" w:hAnsiTheme="majorBidi" w:cstheme="majorBidi" w:hint="cs"/>
-          <w:rtl/>
-          <w:lang w:bidi="he-IL"/>
-        </w:rPr>
-        <w:t xml:space="preserve"> (פונקציות בשפת ריאקט). עכשיו הפתרון הזה יכול להיות יעיל בתוכנה שלא זזה הרבה אבל מכיוון ובתוכנה שלי יש המון קפיצות בין עמודים, לשלוח כל פעם מחדש את הפרמטרים ולדאוג לממש את ה-</w:t>
+        <w:t xml:space="preserve"> זה בעצם הוק בשפת ריאקט. עם הפעולה הזאת ניתן לשמור מצבים של משתנים בצורה לוקלית. אבל מכיוון ומדובר באתר וכל הזמן מקפצים בין עמודים אז שמירת נתונים במקום לוקלי זה לא ממש אופציה. לכן אפשר להעביר אותם כ</w:t>
+      </w:r>
+      <w:r>
+        <w:rPr>
+          <w:rFonts w:asciiTheme="majorBidi" w:hAnsiTheme="majorBidi" w:cstheme="majorBidi" w:hint="cs"/>
+          <w:rtl/>
+          <w:lang w:bidi="he-IL"/>
+        </w:rPr>
+        <w:t>פרופס (פרמטרים בשפת ריאקט) אל הקומפוננטס (פונקציות בשפת ריאקט). עכשיו הפתרון הזה יכול להיות יעיל בתוכנה שלא זזה הרבה אבל מכיוון ובתוכנה שלי יש המון קפיצות בין עמודים, לשלוח כל פעם מחדש את הפרמטרים ולדאוג לממש את ה-</w:t>
       </w:r>
       <w:r>
         <w:rPr>
@@ -6416,25 +6146,7 @@
           <w:rtl/>
           <w:lang w:bidi="he-IL"/>
         </w:rPr>
-        <w:t xml:space="preserve"> האתר עובר </w:t>
-      </w:r>
-      <w:proofErr w:type="spellStart"/>
-      <w:r>
-        <w:rPr>
-          <w:rFonts w:asciiTheme="majorBidi" w:hAnsiTheme="majorBidi" w:cstheme="majorBidi" w:hint="cs"/>
-          <w:rtl/>
-          <w:lang w:bidi="he-IL"/>
-        </w:rPr>
-        <w:t>רינדור</w:t>
-      </w:r>
-      <w:proofErr w:type="spellEnd"/>
-      <w:r>
-        <w:rPr>
-          <w:rFonts w:asciiTheme="majorBidi" w:hAnsiTheme="majorBidi" w:cstheme="majorBidi" w:hint="cs"/>
-          <w:rtl/>
-          <w:lang w:bidi="he-IL"/>
-        </w:rPr>
-        <w:t xml:space="preserve"> חוזר כדי לעדכן את הערך וכל זה יכול מאוד להאט את הביצועים של התוכנה.</w:t>
+        <w:t xml:space="preserve"> האתר עובר רינדור חוזר כדי לעדכן את הערך וכל זה יכול מאוד להאט את הביצועים של התוכנה.</w:t>
       </w:r>
     </w:p>
     <w:p>
@@ -6473,7 +6185,6 @@
         </w:rPr>
         <w:t xml:space="preserve">. </w:t>
       </w:r>
-      <w:proofErr w:type="gramStart"/>
       <w:r>
         <w:rPr>
           <w:rFonts w:asciiTheme="majorBidi" w:hAnsiTheme="majorBidi" w:cstheme="majorBidi"/>
@@ -6487,54 +6198,8 @@
           <w:rtl/>
           <w:lang w:bidi="he-IL"/>
         </w:rPr>
-        <w:t xml:space="preserve"> היא</w:t>
-      </w:r>
-      <w:proofErr w:type="gramEnd"/>
-      <w:r>
-        <w:rPr>
-          <w:rFonts w:asciiTheme="majorBidi" w:hAnsiTheme="majorBidi" w:cstheme="majorBidi" w:hint="cs"/>
-          <w:rtl/>
-          <w:lang w:bidi="he-IL"/>
-        </w:rPr>
-        <w:t xml:space="preserve"> בעצם ספרייה שנותנת לך לשמור משתנים </w:t>
-      </w:r>
-      <w:proofErr w:type="spellStart"/>
-      <w:r>
-        <w:rPr>
-          <w:rFonts w:asciiTheme="majorBidi" w:hAnsiTheme="majorBidi" w:cstheme="majorBidi" w:hint="cs"/>
-          <w:rtl/>
-          <w:lang w:bidi="he-IL"/>
-        </w:rPr>
-        <w:t>כגלובלים</w:t>
-      </w:r>
-      <w:proofErr w:type="spellEnd"/>
-      <w:r>
-        <w:rPr>
-          <w:rFonts w:asciiTheme="majorBidi" w:hAnsiTheme="majorBidi" w:cstheme="majorBidi" w:hint="cs"/>
-          <w:rtl/>
-          <w:lang w:bidi="he-IL"/>
-        </w:rPr>
-        <w:t xml:space="preserve"> בתוכנה. בעצם ריאקט שומרת אצלה במשהו שנקרה 'החנות' את כל המשתנים שאתה רושם אליה וככה אתה יכול לגשת לכל המשתנים באתר ולשנות אותם או להשיג את הערך שלהם. כלומר ריאקט בעצם מציאה פלטפורמה נוחה לשמירה של כל המשתנים באפליקציה בלי הסתרבלות מיותרת ושמירה על סדר. לכן לפרויקט כמו שלי שיש בו שימוש רב </w:t>
-      </w:r>
-      <w:proofErr w:type="spellStart"/>
-      <w:r>
-        <w:rPr>
-          <w:rFonts w:asciiTheme="majorBidi" w:hAnsiTheme="majorBidi" w:cstheme="majorBidi" w:hint="cs"/>
-          <w:rtl/>
-          <w:lang w:bidi="he-IL"/>
-        </w:rPr>
-        <w:t>כלכך</w:t>
-      </w:r>
-      <w:proofErr w:type="spellEnd"/>
-      <w:r>
-        <w:rPr>
-          <w:rFonts w:asciiTheme="majorBidi" w:hAnsiTheme="majorBidi" w:cstheme="majorBidi" w:hint="cs"/>
-          <w:rtl/>
-          <w:lang w:bidi="he-IL"/>
-        </w:rPr>
-        <w:t xml:space="preserve"> במשתנים וכל כך חשוב היעילות </w:t>
-      </w:r>
-      <w:proofErr w:type="spellStart"/>
+        <w:t xml:space="preserve"> היא בעצם ספרייה שנותנת לך לשמור משתנים כגלובלים בתוכנה. בעצם ריאקט שומרת אצלה במשהו שנקרה 'החנות' את כל המשתנים שאתה רושם אליה וככה אתה יכול לגשת לכל המשתנים באתר ולשנות אותם או להשיג את הערך שלהם. כלומר ריאקט בעצם מציאה פלטפורמה נוחה לשמירה של כל המשתנים באפליקציה בלי הסתרבלות מיותרת ושמירה על סדר. לכן לפרויקט כמו שלי שיש בו שימוש רב כלכך במשתנים וכל כך חשוב היעילות </w:t>
+      </w:r>
       <w:r>
         <w:rPr>
           <w:rFonts w:asciiTheme="majorBidi" w:hAnsiTheme="majorBidi" w:cstheme="majorBidi" w:hint="cs"/>
@@ -6543,7 +6208,6 @@
         </w:rPr>
         <w:t>רידוקס</w:t>
       </w:r>
-      <w:proofErr w:type="spellEnd"/>
       <w:r>
         <w:rPr>
           <w:rFonts w:asciiTheme="majorBidi" w:hAnsiTheme="majorBidi" w:cstheme="majorBidi" w:hint="cs"/>
@@ -6586,51 +6250,15 @@
           <w:rtl/>
           <w:lang w:bidi="he-IL"/>
         </w:rPr>
-        <w:t xml:space="preserve">עכשיו מבחינת ידע, אני לא מבין כלל </w:t>
-      </w:r>
-      <w:proofErr w:type="spellStart"/>
-      <w:r>
-        <w:rPr>
-          <w:rFonts w:asciiTheme="majorBidi" w:hAnsiTheme="majorBidi" w:cstheme="majorBidi" w:hint="cs"/>
-          <w:rtl/>
-          <w:lang w:bidi="he-IL"/>
-        </w:rPr>
-        <w:t>בריאקט</w:t>
-      </w:r>
-      <w:proofErr w:type="spellEnd"/>
-      <w:r>
-        <w:rPr>
-          <w:rFonts w:asciiTheme="majorBidi" w:hAnsiTheme="majorBidi" w:cstheme="majorBidi" w:hint="cs"/>
-          <w:rtl/>
-          <w:lang w:bidi="he-IL"/>
-        </w:rPr>
-        <w:t xml:space="preserve">. אני חייב לחקור את התחום לעומק ולהבין איך ה'חנות' הזאת עובדת ואיך מנהלים אותה מכיוון ושמירת </w:t>
-      </w:r>
-      <w:r>
-        <w:rPr>
-          <w:rFonts w:asciiTheme="majorBidi" w:hAnsiTheme="majorBidi" w:cstheme="majorBidi" w:hint="cs"/>
-          <w:rtl/>
-          <w:lang w:bidi="he-IL"/>
-        </w:rPr>
-        <w:t xml:space="preserve">משתנים </w:t>
-      </w:r>
-      <w:proofErr w:type="spellStart"/>
-      <w:r>
-        <w:rPr>
-          <w:rFonts w:asciiTheme="majorBidi" w:hAnsiTheme="majorBidi" w:cstheme="majorBidi" w:hint="cs"/>
-          <w:rtl/>
-          <w:lang w:bidi="he-IL"/>
-        </w:rPr>
-        <w:t>בריאקט</w:t>
-      </w:r>
-      <w:proofErr w:type="spellEnd"/>
-      <w:r>
-        <w:rPr>
-          <w:rFonts w:asciiTheme="majorBidi" w:hAnsiTheme="majorBidi" w:cstheme="majorBidi" w:hint="cs"/>
-          <w:rtl/>
-          <w:lang w:bidi="he-IL"/>
-        </w:rPr>
-        <w:t xml:space="preserve"> תקל על כל ניהול הפרויקט שלי. תשמור אותו קריא מסודר וקל לשינו, ויעזור לי להמשיך אותו.</w:t>
+        <w:t xml:space="preserve">עכשיו מבחינת ידע, אני לא מבין כלל בריאקט. אני חייב לחקור את התחום לעומק ולהבין איך ה'חנות' הזאת עובדת ואיך מנהלים אותה מכיוון ושמירת </w:t>
+      </w:r>
+      <w:r>
+        <w:rPr>
+          <w:rFonts w:asciiTheme="majorBidi" w:hAnsiTheme="majorBidi" w:cstheme="majorBidi" w:hint="cs"/>
+          <w:rtl/>
+          <w:lang w:bidi="he-IL"/>
+        </w:rPr>
+        <w:t>משתנים בריאקט תקל על כל ניהול הפרויקט שלי. תשמור אותו קריא מסודר וקל לשינו, ויעזור לי להמשיך אותו.</w:t>
       </w:r>
       <w:r>
         <w:rPr>
@@ -7240,29 +6868,7 @@
           <w:rtl/>
           <w:lang w:bidi="he-IL"/>
         </w:rPr>
-        <w:t>איך מתכננים מבנה נכון (</w:t>
-      </w:r>
-      <w:proofErr w:type="spellStart"/>
-      <w:r>
-        <w:rPr>
-          <w:rFonts w:asciiTheme="majorBidi" w:hAnsiTheme="majorBidi"/>
-          <w:sz w:val="24"/>
-          <w:szCs w:val="24"/>
-          <w:rtl/>
-          <w:lang w:bidi="he-IL"/>
-        </w:rPr>
-        <w:t>סכימה</w:t>
-      </w:r>
-      <w:proofErr w:type="spellEnd"/>
-      <w:r>
-        <w:rPr>
-          <w:rFonts w:asciiTheme="majorBidi" w:hAnsiTheme="majorBidi"/>
-          <w:sz w:val="24"/>
-          <w:szCs w:val="24"/>
-          <w:rtl/>
-          <w:lang w:bidi="he-IL"/>
-        </w:rPr>
-        <w:t>)</w:t>
+        <w:t>איך מתכננים מבנה נכון (סכימה)</w:t>
       </w:r>
     </w:p>
     <w:p>
@@ -8029,25 +7635,14 @@
           <w:lang w:bidi="he-IL"/>
         </w:rPr>
       </w:pPr>
-      <w:proofErr w:type="spellStart"/>
-      <w:r>
-        <w:rPr>
-          <w:rFonts w:asciiTheme="majorBidi" w:hAnsiTheme="majorBidi"/>
-          <w:sz w:val="24"/>
-          <w:szCs w:val="24"/>
-          <w:lang w:bidi="he-IL"/>
-        </w:rPr>
-        <w:t>WebSockets</w:t>
-      </w:r>
-      <w:proofErr w:type="spellEnd"/>
-      <w:r>
-        <w:rPr>
-          <w:rFonts w:asciiTheme="majorBidi" w:hAnsiTheme="majorBidi"/>
-          <w:sz w:val="24"/>
-          <w:szCs w:val="24"/>
-          <w:lang w:bidi="he-IL"/>
-        </w:rPr>
-        <w:t xml:space="preserve"> </w:t>
+      <w:r>
+        <w:rPr>
+          <w:rFonts w:asciiTheme="majorBidi" w:hAnsiTheme="majorBidi"/>
+          <w:sz w:val="24"/>
+          <w:szCs w:val="24"/>
+          <w:lang w:bidi="he-IL"/>
+        </w:rPr>
+        <w:t xml:space="preserve">WebSockets </w:t>
       </w:r>
     </w:p>
     <w:p>
@@ -8149,25 +7744,7 @@
           <w:rtl/>
           <w:lang w:bidi="he-IL"/>
         </w:rPr>
-        <w:t xml:space="preserve">ניבות טוב של הודעות </w:t>
-      </w:r>
-      <w:proofErr w:type="spellStart"/>
-      <w:r>
-        <w:rPr>
-          <w:rFonts w:asciiTheme="majorBidi" w:hAnsiTheme="majorBidi" w:cstheme="majorBidi" w:hint="cs"/>
-          <w:rtl/>
-          <w:lang w:bidi="he-IL"/>
-        </w:rPr>
-        <w:t>ממשתנש</w:t>
-      </w:r>
-      <w:proofErr w:type="spellEnd"/>
-      <w:r>
-        <w:rPr>
-          <w:rFonts w:asciiTheme="majorBidi" w:hAnsiTheme="majorBidi" w:cstheme="majorBidi" w:hint="cs"/>
-          <w:rtl/>
-          <w:lang w:bidi="he-IL"/>
-        </w:rPr>
-        <w:t xml:space="preserve"> אל משתמש בלי לאבד הודעות בדרך</w:t>
+        <w:t>ניבות טוב של הודעות ממשתנש אל משתמש בלי לאבד הודעות בדרך</w:t>
       </w:r>
     </w:p>
     <w:p>
@@ -9016,29 +8593,7 @@
           <w:rtl/>
           <w:lang w:bidi="he-IL"/>
         </w:rPr>
-        <w:t xml:space="preserve"> המון חלקים בפרויקט דומים אחד לשני במימוש אבל בגלל הרמת הרשאה של המשתמש זה משתנה. אצטרך להבין איך אני מתכנת את </w:t>
-      </w:r>
-      <w:proofErr w:type="spellStart"/>
-      <w:r>
-        <w:rPr>
-          <w:rFonts w:asciiTheme="majorBidi" w:hAnsiTheme="majorBidi" w:hint="cs"/>
-          <w:sz w:val="24"/>
-          <w:szCs w:val="24"/>
-          <w:rtl/>
-          <w:lang w:bidi="he-IL"/>
-        </w:rPr>
-        <w:t>הכל</w:t>
-      </w:r>
-      <w:proofErr w:type="spellEnd"/>
-      <w:r>
-        <w:rPr>
-          <w:rFonts w:asciiTheme="majorBidi" w:hAnsiTheme="majorBidi" w:hint="cs"/>
-          <w:sz w:val="24"/>
-          <w:szCs w:val="24"/>
-          <w:rtl/>
-          <w:lang w:bidi="he-IL"/>
-        </w:rPr>
-        <w:t xml:space="preserve"> בצורה יעילה למימוש ושימוש מכיוון ופרויקט כל כך גדול ללא שום תכנון מקדים נהיה מסורבל במהירות.</w:t>
+        <w:t xml:space="preserve"> המון חלקים בפרויקט דומים אחד לשני במימוש אבל בגלל הרמת הרשאה של המשתמש זה משתנה. אצטרך להבין איך אני מתכנת את הכל בצורה יעילה למימוש ושימוש מכיוון ופרויקט כל כך גדול ללא שום תכנון מקדים נהיה מסורבל במהירות.</w:t>
       </w:r>
       <w:r>
         <w:rPr>
@@ -9299,9 +8854,8 @@
           <w:rtl/>
           <w:lang w:bidi="he-IL"/>
         </w:rPr>
-        <w:t xml:space="preserve"> באתר המון פיצ'רים שאצטרך להבין איך אני משלב עם </w:t>
-      </w:r>
-      <w:proofErr w:type="spellStart"/>
+        <w:t xml:space="preserve"> באתר המון פיצ'רים שאצטרך להבין איך אני משלב עם הכל בצורה הכי יעילה</w:t>
+      </w:r>
       <w:r>
         <w:rPr>
           <w:rFonts w:asciiTheme="majorBidi" w:hAnsiTheme="majorBidi" w:hint="cs"/>
@@ -9310,27 +8864,6 @@
           <w:rtl/>
           <w:lang w:bidi="he-IL"/>
         </w:rPr>
-        <w:t>הכל</w:t>
-      </w:r>
-      <w:proofErr w:type="spellEnd"/>
-      <w:r>
-        <w:rPr>
-          <w:rFonts w:asciiTheme="majorBidi" w:hAnsiTheme="majorBidi" w:hint="cs"/>
-          <w:sz w:val="24"/>
-          <w:szCs w:val="24"/>
-          <w:rtl/>
-          <w:lang w:bidi="he-IL"/>
-        </w:rPr>
-        <w:t xml:space="preserve"> בצורה הכי יעילה</w:t>
-      </w:r>
-      <w:r>
-        <w:rPr>
-          <w:rFonts w:asciiTheme="majorBidi" w:hAnsiTheme="majorBidi" w:hint="cs"/>
-          <w:sz w:val="24"/>
-          <w:szCs w:val="24"/>
-          <w:rtl/>
-          <w:lang w:bidi="he-IL"/>
-        </w:rPr>
         <w:t xml:space="preserve"> וקלה למימוש ולכן אצטרך לעשות תכנון מעמיק ולעבוד לאט וביעילות בכל צעד של הפרויקט ולחשוב כמה צעדים קדימה בכל דבר שאני עושה</w:t>
       </w:r>
     </w:p>
@@ -9374,29 +8907,7 @@
           <w:rtl/>
           <w:lang w:bidi="he-IL"/>
         </w:rPr>
-        <w:t xml:space="preserve">כל אחד מהנושאים האלה דורש ממני מחקר מעמיק, ניסוי </w:t>
-      </w:r>
-      <w:proofErr w:type="spellStart"/>
-      <w:r>
-        <w:rPr>
-          <w:rFonts w:asciiTheme="majorBidi" w:hAnsiTheme="majorBidi"/>
-          <w:sz w:val="24"/>
-          <w:szCs w:val="24"/>
-          <w:rtl/>
-          <w:lang w:bidi="he-IL"/>
-        </w:rPr>
-        <w:t>וטעייה</w:t>
-      </w:r>
-      <w:proofErr w:type="spellEnd"/>
-      <w:r>
-        <w:rPr>
-          <w:rFonts w:asciiTheme="majorBidi" w:hAnsiTheme="majorBidi"/>
-          <w:sz w:val="24"/>
-          <w:szCs w:val="24"/>
-          <w:rtl/>
-          <w:lang w:bidi="he-IL"/>
-        </w:rPr>
-        <w:t>, למידה עצמית ויישום של טכנולוגיות שלא הכרתי. הפרויקט הופך להיות גם תהליך של בנייה וגם מסע למידה משמעותי שמכין אותי לעולם התכנות האמיתי</w:t>
+        <w:t>כל אחד מהנושאים האלה דורש ממני מחקר מעמיק, ניסוי וטעייה, למידה עצמית ויישום של טכנולוגיות שלא הכרתי. הפרויקט הופך להיות גם תהליך של בנייה וגם מסע למידה משמעותי שמכין אותי לעולם התכנות האמיתי</w:t>
       </w:r>
       <w:r>
         <w:rPr>
@@ -10076,29 +9587,7 @@
                 <w:rtl/>
                 <w:lang w:bidi="he-IL"/>
               </w:rPr>
-              <w:t xml:space="preserve">משתמשים או רובוטים יכולים </w:t>
-            </w:r>
-            <w:proofErr w:type="spellStart"/>
-            <w:r>
-              <w:rPr>
-                <w:rFonts w:hint="cs"/>
-                <w:sz w:val="28"/>
-                <w:szCs w:val="28"/>
-                <w:rtl/>
-                <w:lang w:bidi="he-IL"/>
-              </w:rPr>
-              <w:t>להספים</w:t>
-            </w:r>
-            <w:proofErr w:type="spellEnd"/>
-            <w:r>
-              <w:rPr>
-                <w:rFonts w:hint="cs"/>
-                <w:sz w:val="28"/>
-                <w:szCs w:val="28"/>
-                <w:rtl/>
-                <w:lang w:bidi="he-IL"/>
-              </w:rPr>
-              <w:t xml:space="preserve"> בהודעות או להזמין תורים בכמויות ולפגוע בשימוש האתר</w:t>
+              <w:t>משתמשים או רובוטים יכולים להספים בהודעות או להזמין תורים בכמויות ולפגוע בשימוש האתר</w:t>
             </w:r>
           </w:p>
         </w:tc>
@@ -10418,7 +9907,6 @@
               </w:rPr>
               <w:t xml:space="preserve">לקוחות שמנסים להיכנס עם התקפות כמו </w:t>
             </w:r>
-            <w:proofErr w:type="spellStart"/>
             <w:r>
               <w:rPr>
                 <w:rFonts w:hint="cs"/>
@@ -10436,7 +9924,6 @@
               </w:rPr>
               <w:t>ruteForce</w:t>
             </w:r>
-            <w:proofErr w:type="spellEnd"/>
           </w:p>
         </w:tc>
         <w:tc>
@@ -10461,20 +9948,8 @@
                 <w:rtl/>
                 <w:lang w:bidi="he-IL"/>
               </w:rPr>
-              <w:t xml:space="preserve">לשים מספר מוגבל של נסיונות </w:t>
+              <w:t>לשים מספר מוגבל של נסיונות להתחר</w:t>
             </w:r>
-            <w:proofErr w:type="spellStart"/>
-            <w:r>
-              <w:rPr>
-                <w:rFonts w:hint="cs"/>
-                <w:sz w:val="28"/>
-                <w:szCs w:val="28"/>
-                <w:rtl/>
-                <w:lang w:bidi="he-IL"/>
-              </w:rPr>
-              <w:t>להתחר</w:t>
-            </w:r>
-            <w:proofErr w:type="spellEnd"/>
           </w:p>
         </w:tc>
       </w:tr>
@@ -10726,29 +10201,7 @@
                 <w:rtl/>
                 <w:lang w:bidi="he-IL"/>
               </w:rPr>
-              <w:t xml:space="preserve">להשתמש </w:t>
-            </w:r>
-            <w:proofErr w:type="spellStart"/>
-            <w:r>
-              <w:rPr>
-                <w:rFonts w:hint="cs"/>
-                <w:sz w:val="28"/>
-                <w:szCs w:val="28"/>
-                <w:rtl/>
-                <w:lang w:bidi="he-IL"/>
-              </w:rPr>
-              <w:t>בהצפנות</w:t>
-            </w:r>
-            <w:proofErr w:type="spellEnd"/>
-            <w:r>
-              <w:rPr>
-                <w:rFonts w:hint="cs"/>
-                <w:sz w:val="28"/>
-                <w:szCs w:val="28"/>
-                <w:rtl/>
-                <w:lang w:bidi="he-IL"/>
-              </w:rPr>
-              <w:t xml:space="preserve"> למידע אישי לצורך שמירה על פרטיות המשתמש</w:t>
+              <w:t>להשתמש בהצפנות למידע אישי לצורך שמירה על פרטיות המשתמש</w:t>
             </w:r>
           </w:p>
         </w:tc>
@@ -10849,25 +10302,7 @@
           <w:rtl/>
           <w:lang w:bidi="he-IL"/>
         </w:rPr>
-        <w:t xml:space="preserve">ברגע שהמידע נשלח אל השרת </w:t>
-      </w:r>
-      <w:proofErr w:type="spellStart"/>
-      <w:r>
-        <w:rPr>
-          <w:rFonts w:asciiTheme="majorBidi" w:hAnsiTheme="majorBidi" w:cstheme="majorBidi" w:hint="cs"/>
-          <w:rtl/>
-          <w:lang w:bidi="he-IL"/>
-        </w:rPr>
-        <w:t>השרת</w:t>
-      </w:r>
-      <w:proofErr w:type="spellEnd"/>
-      <w:r>
-        <w:rPr>
-          <w:rFonts w:asciiTheme="majorBidi" w:hAnsiTheme="majorBidi" w:cstheme="majorBidi" w:hint="cs"/>
-          <w:rtl/>
-          <w:lang w:bidi="he-IL"/>
-        </w:rPr>
-        <w:t xml:space="preserve"> בוחר איזה עמוד הרשמה הוא מעביר ללקוח, משתמש או בעל מקצוע.</w:t>
+        <w:t>ברגע שהמידע נשלח אל השרת השרת בוחר איזה עמוד הרשמה הוא מעביר ללקוח, משתמש או בעל מקצוע.</w:t>
       </w:r>
     </w:p>
     <w:p>
@@ -11535,7 +10970,6 @@
         </w:rPr>
         <w:t xml:space="preserve"> ניסיונות השרת ינתק את הלקוח כדי למנוע התקפות </w:t>
       </w:r>
-      <w:proofErr w:type="spellStart"/>
       <w:r>
         <w:rPr>
           <w:rFonts w:asciiTheme="majorBidi" w:hAnsiTheme="majorBidi" w:cstheme="majorBidi"/>
@@ -11543,7 +10977,6 @@
         </w:rPr>
         <w:t>BruteForce</w:t>
       </w:r>
-      <w:proofErr w:type="spellEnd"/>
       <w:r>
         <w:rPr>
           <w:rFonts w:asciiTheme="majorBidi" w:hAnsiTheme="majorBidi" w:cstheme="majorBidi" w:hint="cs"/>
@@ -14682,23 +14115,13 @@
         </w:rPr>
         <w:br/>
       </w:r>
-      <w:proofErr w:type="spellStart"/>
-      <w:r>
-        <w:rPr>
-          <w:rFonts w:asciiTheme="majorBidi" w:hAnsiTheme="majorBidi" w:cstheme="majorBidi"/>
-          <w:rtl/>
-          <w:lang w:bidi="he-IL"/>
-        </w:rPr>
-        <w:t>כשלא</w:t>
-      </w:r>
-      <w:proofErr w:type="spellEnd"/>
-      <w:r>
-        <w:rPr>
-          <w:rFonts w:asciiTheme="majorBidi" w:hAnsiTheme="majorBidi" w:cstheme="majorBidi"/>
-          <w:rtl/>
-          <w:lang w:bidi="he-IL"/>
-        </w:rPr>
-        <w:t xml:space="preserve"> — האתר נהיה איטי ככל שהפרויקט גדל</w:t>
+      <w:r>
+        <w:rPr>
+          <w:rFonts w:asciiTheme="majorBidi" w:hAnsiTheme="majorBidi" w:cstheme="majorBidi"/>
+          <w:rtl/>
+          <w:lang w:bidi="he-IL"/>
+        </w:rPr>
+        <w:t>כשלא — האתר נהיה איטי ככל שהפרויקט גדל</w:t>
       </w:r>
       <w:r>
         <w:rPr>
@@ -14737,18 +14160,8 @@
           <w:rtl/>
           <w:lang w:bidi="he-IL"/>
         </w:rPr>
-        <w:t xml:space="preserve">תכנון נכון מאפשר להוסיף פיצ’רים חדשים בלי לשבור את </w:t>
-      </w:r>
-      <w:proofErr w:type="spellStart"/>
-      <w:r>
-        <w:rPr>
-          <w:rFonts w:asciiTheme="majorBidi" w:hAnsiTheme="majorBidi" w:cstheme="majorBidi"/>
-          <w:rtl/>
-          <w:lang w:bidi="he-IL"/>
-        </w:rPr>
-        <w:t>הכל</w:t>
-      </w:r>
-      <w:proofErr w:type="spellEnd"/>
+        <w:t>תכנון נכון מאפשר להוסיף פיצ’רים חדשים בלי לשבור את הכל</w:t>
+      </w:r>
       <w:r>
         <w:rPr>
           <w:rFonts w:asciiTheme="majorBidi" w:hAnsiTheme="majorBidi" w:cstheme="majorBidi"/>
@@ -15287,18 +14700,7 @@
           <w:rtl/>
           <w:lang w:bidi="he-IL"/>
         </w:rPr>
-        <w:t xml:space="preserve"> של סיסמה </w:t>
-      </w:r>
-      <w:proofErr w:type="gramStart"/>
-      <w:r>
-        <w:rPr>
-          <w:rFonts w:asciiTheme="majorBidi" w:hAnsiTheme="majorBidi" w:cstheme="majorBidi" w:hint="cs"/>
-          <w:b/>
-          <w:bCs/>
-          <w:rtl/>
-          <w:lang w:bidi="he-IL"/>
-        </w:rPr>
-        <w:t xml:space="preserve">- </w:t>
+        <w:t xml:space="preserve"> של סיסמה - </w:t>
       </w:r>
       <w:r>
         <w:rPr>
@@ -15313,16 +14715,7 @@
           <w:rtl/>
           <w:lang w:bidi="he-IL"/>
         </w:rPr>
-        <w:t>סיסמה</w:t>
-      </w:r>
-      <w:proofErr w:type="gramEnd"/>
-      <w:r>
-        <w:rPr>
-          <w:rFonts w:asciiTheme="majorBidi" w:hAnsiTheme="majorBidi" w:cstheme="majorBidi"/>
-          <w:rtl/>
-          <w:lang w:bidi="he-IL"/>
-        </w:rPr>
-        <w:t xml:space="preserve"> מוצפנת</w:t>
+        <w:t>סיסמה מוצפנת</w:t>
       </w:r>
       <w:r>
         <w:rPr>

</xml_diff>